<commit_message>
The resources are added
</commit_message>
<xml_diff>
--- a/01-decision-trees-random-forests/Resources.docx
+++ b/01-decision-trees-random-forests/Resources.docx
@@ -51,7 +51,7 @@
           <w:lang w:val="en-US"/>
         </w:rPr>
       </w:pPr>
-      <w:hyperlink r:id="rId4" w:history="1">
+      <w:hyperlink r:id="rId4" w:anchor="room=2543529b42e2db1a49cc,jugFg2ZNm4hNHfGPApbolA" w:history="1">
         <w:r>
           <w:rPr>
             <w:rStyle w:val="Hyperlink"/>
@@ -232,7 +232,7 @@
           <w:lang w:val="en-US"/>
         </w:rPr>
       </w:pPr>
-      <w:hyperlink r:id="rId7" w:history="1">
+      <w:hyperlink r:id="rId7" w:anchor="scrollTo=rbdC2AmEYSfZ" w:history="1">
         <w:r>
           <w:rPr>
             <w:rStyle w:val="Hyperlink"/>
@@ -482,6 +482,7 @@
         <w:rPr>
           <w:rFonts w:cs="Times New Roman"/>
           <w:szCs w:val="28"/>
+          <w:lang w:val="en-US"/>
         </w:rPr>
       </w:pPr>
       <w:r>
@@ -489,6 +490,7 @@
           <w:rFonts w:eastAsia="Arial" w:cs="Times New Roman"/>
           <w:color w:val="444444"/>
           <w:szCs w:val="28"/>
+          <w:lang w:val="en-US"/>
         </w:rPr>
         <w:t>explained.ai</w:t>
       </w:r>
@@ -533,6 +535,31 @@
           <w:lang w:val="en-US"/>
         </w:rPr>
         <w:t>Miro write and stick they opinions</w:t>
+      </w:r>
+    </w:p>
+    <w:p>
+      <w:pPr>
+        <w:spacing w:after="0"/>
+        <w:ind w:firstLine="709"/>
+        <w:jc w:val="both"/>
+        <w:rPr>
+          <w:lang w:val="en-US"/>
+        </w:rPr>
+      </w:pPr>
+      <w:hyperlink r:id="rId11" w:history="1">
+        <w:r>
+          <w:rPr>
+            <w:rStyle w:val="Hyperlink"/>
+            <w:lang w:val="en-US"/>
+          </w:rPr>
+          <w:t>https://www.mentimeter.com/app/presentation/alfka9nb32koh39pm7o13k36p1ege7hb/edit</w:t>
+        </w:r>
+      </w:hyperlink>
+      <w:r>
+        <w:rPr>
+          <w:lang w:val="en-US"/>
+        </w:rPr>
+        <w:t xml:space="preserve"> </w:t>
       </w:r>
     </w:p>
     <w:sectPr>

</xml_diff>